<commit_message>
docs: Add initial draft of the humanized paper.
</commit_message>
<xml_diff>
--- a/research/Humanized_Paper_Draft.docx
+++ b/research/Humanized_Paper_Draft.docx
@@ -80,7 +80,7 @@
       </w:r>
     </w:p>
     <w:bookmarkEnd w:id="10"/>
-    <w:bookmarkStart w:id="17" w:name="iii.-methodology"/>
+    <w:bookmarkStart w:id="18" w:name="iii.-methodology"/>
     <w:p>
       <w:pPr>
         <w:pStyle w:val="Heading1"/>
@@ -561,7 +561,7 @@
     </w:p>
     <w:bookmarkEnd w:id="13"/>
     <w:bookmarkEnd w:id="14"/>
-    <w:bookmarkStart w:id="16" w:name="X81800c01dd68ac0c4d42d0c0cb9ae0e4fb4f851"/>
+    <w:bookmarkStart w:id="17" w:name="X81800c01dd68ac0c4d42d0c0cb9ae0e4fb4f851"/>
     <w:p>
       <w:pPr>
         <w:pStyle w:val="Heading2"/>
@@ -1675,6 +1675,299 @@
         <w:t xml:space="preserve">), forcing the agent to learn stealth and avoid noisy bruteforcing.</w:t>
       </w:r>
     </w:p>
+    <w:bookmarkEnd w:id="15"/>
+    <w:bookmarkStart w:id="16" w:name="phase-based-training-algorithm"/>
+    <w:p>
+      <w:pPr>
+        <w:pStyle w:val="Heading3"/>
+      </w:pPr>
+      <w:r>
+        <w:t xml:space="preserve">2) Phase-Based Training Algorithm</w:t>
+      </w:r>
+    </w:p>
+    <w:p>
+      <w:pPr>
+        <w:pStyle w:val="FirstParagraph"/>
+      </w:pPr>
+      <w:r>
+        <w:t xml:space="preserve">To stabilize learning and prevent the agent from indiscriminately firing complex exploits before understanding the target surface area, we implement a phase-based curriculum. Algorithm 1 illustrates the overall simulated penetration testing loop:</w:t>
+      </w:r>
+    </w:p>
+    <w:p>
+      <w:pPr>
+        <w:pStyle w:val="BodyText"/>
+      </w:pPr>
+      <w:r>
+        <w:rPr>
+          <w:b/>
+          <w:bCs/>
+        </w:rPr>
+        <w:t xml:space="preserve">Algorithm 1: Phase-Based D3QN Training Process</w:t>
+      </w:r>
+    </w:p>
+    <w:p>
+      <w:pPr>
+        <w:pStyle w:val="SourceCode"/>
+      </w:pPr>
+      <w:r>
+        <w:rPr>
+          <w:rStyle w:val="VerbatimChar"/>
+        </w:rPr>
+        <w:t xml:space="preserve">Initialize replay buffer D to capacity N</w:t>
+      </w:r>
+      <w:r>
+        <w:br/>
+      </w:r>
+      <w:r>
+        <w:rPr>
+          <w:rStyle w:val="VerbatimChar"/>
+        </w:rPr>
+        <w:t xml:space="preserve">Initialize primary action-value network Q with random weights θ</w:t>
+      </w:r>
+      <w:r>
+        <w:br/>
+      </w:r>
+      <w:r>
+        <w:rPr>
+          <w:rStyle w:val="VerbatimChar"/>
+        </w:rPr>
+        <w:t xml:space="preserve">Initialize target action-value network Q' with weights θ' = θ</w:t>
+      </w:r>
+      <w:r>
+        <w:br/>
+      </w:r>
+      <w:r>
+        <w:rPr>
+          <w:rStyle w:val="VerbatimChar"/>
+        </w:rPr>
+        <w:t xml:space="preserve">Initialize Phase = 0 (Reconnaissance)</w:t>
+      </w:r>
+      <w:r>
+        <w:br/>
+      </w:r>
+      <w:r>
+        <w:br/>
+      </w:r>
+      <w:r>
+        <w:rPr>
+          <w:rStyle w:val="VerbatimChar"/>
+        </w:rPr>
+        <w:t xml:space="preserve">For episode = 1 to M do</w:t>
+      </w:r>
+      <w:r>
+        <w:br/>
+      </w:r>
+      <w:r>
+        <w:rPr>
+          <w:rStyle w:val="VerbatimChar"/>
+        </w:rPr>
+        <w:t xml:space="preserve">    Reset WebSecurityGym Environment</w:t>
+      </w:r>
+      <w:r>
+        <w:br/>
+      </w:r>
+      <w:r>
+        <w:rPr>
+          <w:rStyle w:val="VerbatimChar"/>
+        </w:rPr>
+        <w:t xml:space="preserve">    Observe initial HTTP state s_1</w:t>
+      </w:r>
+      <w:r>
+        <w:br/>
+      </w:r>
+      <w:r>
+        <w:br/>
+      </w:r>
+      <w:r>
+        <w:rPr>
+          <w:rStyle w:val="VerbatimChar"/>
+        </w:rPr>
+        <w:t xml:space="preserve">    For step t = 1 to T do</w:t>
+      </w:r>
+      <w:r>
+        <w:br/>
+      </w:r>
+      <w:r>
+        <w:rPr>
+          <w:rStyle w:val="VerbatimChar"/>
+        </w:rPr>
+        <w:t xml:space="preserve">        With probability ε, select random action a_t from allowed Phase actions</w:t>
+      </w:r>
+      <w:r>
+        <w:br/>
+      </w:r>
+      <w:r>
+        <w:rPr>
+          <w:rStyle w:val="VerbatimChar"/>
+        </w:rPr>
+        <w:t xml:space="preserve">        Otherwise, select a_t = argmax_a Q(s_t, a; θ)</w:t>
+      </w:r>
+      <w:r>
+        <w:br/>
+      </w:r>
+      <w:r>
+        <w:br/>
+      </w:r>
+      <w:r>
+        <w:rPr>
+          <w:rStyle w:val="VerbatimChar"/>
+        </w:rPr>
+        <w:t xml:space="preserve">        Execute payload/action a_t against target endpoints</w:t>
+      </w:r>
+      <w:r>
+        <w:br/>
+      </w:r>
+      <w:r>
+        <w:rPr>
+          <w:rStyle w:val="VerbatimChar"/>
+        </w:rPr>
+        <w:t xml:space="preserve">        Observe reward r_t, parsed numerical next state s_{t+1}, and done signal</w:t>
+      </w:r>
+      <w:r>
+        <w:br/>
+      </w:r>
+      <w:r>
+        <w:br/>
+      </w:r>
+      <w:r>
+        <w:rPr>
+          <w:rStyle w:val="VerbatimChar"/>
+        </w:rPr>
+        <w:t xml:space="preserve">        Store transition (s_t, a_t, r_t, s_{t+1}) in replay buffer D</w:t>
+      </w:r>
+      <w:r>
+        <w:br/>
+      </w:r>
+      <w:r>
+        <w:br/>
+      </w:r>
+      <w:r>
+        <w:rPr>
+          <w:rStyle w:val="VerbatimChar"/>
+        </w:rPr>
+        <w:t xml:space="preserve">        If len(D) &gt; batch_size:</w:t>
+      </w:r>
+      <w:r>
+        <w:br/>
+      </w:r>
+      <w:r>
+        <w:rPr>
+          <w:rStyle w:val="VerbatimChar"/>
+        </w:rPr>
+        <w:t xml:space="preserve">            Sample random minibatch of transitions from D</w:t>
+      </w:r>
+      <w:r>
+        <w:br/>
+      </w:r>
+      <w:r>
+        <w:rPr>
+          <w:rStyle w:val="VerbatimChar"/>
+        </w:rPr>
+        <w:t xml:space="preserve">            Compute Double Q-Learning target value references</w:t>
+      </w:r>
+      <w:r>
+        <w:br/>
+      </w:r>
+      <w:r>
+        <w:rPr>
+          <w:rStyle w:val="VerbatimChar"/>
+        </w:rPr>
+        <w:t xml:space="preserve">            Perform gradient descent step on loss to update weights θ</w:t>
+      </w:r>
+      <w:r>
+        <w:br/>
+      </w:r>
+      <w:r>
+        <w:br/>
+      </w:r>
+      <w:r>
+        <w:rPr>
+          <w:rStyle w:val="VerbatimChar"/>
+        </w:rPr>
+        <w:t xml:space="preserve">        Every C steps: update target network weights θ' = θ</w:t>
+      </w:r>
+      <w:r>
+        <w:br/>
+      </w:r>
+      <w:r>
+        <w:br/>
+      </w:r>
+      <w:r>
+        <w:rPr>
+          <w:rStyle w:val="VerbatimChar"/>
+        </w:rPr>
+        <w:t xml:space="preserve">        If done is True:</w:t>
+      </w:r>
+      <w:r>
+        <w:br/>
+      </w:r>
+      <w:r>
+        <w:rPr>
+          <w:rStyle w:val="VerbatimChar"/>
+        </w:rPr>
+        <w:t xml:space="preserve">            Break out of step loop</w:t>
+      </w:r>
+      <w:r>
+        <w:br/>
+      </w:r>
+      <w:r>
+        <w:br/>
+      </w:r>
+      <w:r>
+        <w:rPr>
+          <w:rStyle w:val="VerbatimChar"/>
+        </w:rPr>
+        <w:t xml:space="preserve">        s_t = s_{t+1}</w:t>
+      </w:r>
+      <w:r>
+        <w:br/>
+      </w:r>
+      <w:r>
+        <w:rPr>
+          <w:rStyle w:val="VerbatimChar"/>
+        </w:rPr>
+        <w:t xml:space="preserve">    End For</w:t>
+      </w:r>
+      <w:r>
+        <w:br/>
+      </w:r>
+      <w:r>
+        <w:br/>
+      </w:r>
+      <w:r>
+        <w:rPr>
+          <w:rStyle w:val="VerbatimChar"/>
+        </w:rPr>
+        <w:t xml:space="preserve">    If agent regularly achieves high cumulative_reward:</w:t>
+      </w:r>
+      <w:r>
+        <w:br/>
+      </w:r>
+      <w:r>
+        <w:rPr>
+          <w:rStyle w:val="VerbatimChar"/>
+        </w:rPr>
+        <w:t xml:space="preserve">        Unlock advanced actions (Phase 1: Assessment, Phase 2: Exploitation)</w:t>
+      </w:r>
+      <w:r>
+        <w:br/>
+      </w:r>
+      <w:r>
+        <w:rPr>
+          <w:rStyle w:val="VerbatimChar"/>
+        </w:rPr>
+        <w:t xml:space="preserve">        Phase = update_curriculum_phase(cumulative_reward)</w:t>
+      </w:r>
+      <w:r>
+        <w:br/>
+      </w:r>
+      <w:r>
+        <w:rPr>
+          <w:rStyle w:val="VerbatimChar"/>
+        </w:rPr>
+        <w:t xml:space="preserve">End For</w:t>
+      </w:r>
+    </w:p>
     <w:p>
       <w:r>
         <w:pict>
@@ -1682,10 +1975,10 @@
         </w:pict>
       </w:r>
     </w:p>
-    <w:bookmarkEnd w:id="15"/>
     <w:bookmarkEnd w:id="16"/>
     <w:bookmarkEnd w:id="17"/>
-    <w:bookmarkStart w:id="18" w:name="iv.-evaluation-and-results"/>
+    <w:bookmarkEnd w:id="18"/>
+    <w:bookmarkStart w:id="19" w:name="iv.-evaluation-and-results"/>
     <w:p>
       <w:pPr>
         <w:pStyle w:val="Heading1"/>
@@ -3527,8 +3820,8 @@
         </w:pict>
       </w:r>
     </w:p>
-    <w:bookmarkEnd w:id="18"/>
-    <w:bookmarkStart w:id="19" w:name="vi.-conclusion"/>
+    <w:bookmarkEnd w:id="19"/>
+    <w:bookmarkStart w:id="20" w:name="vi.-conclusion"/>
     <w:p>
       <w:pPr>
         <w:pStyle w:val="Heading1"/>
@@ -3576,7 +3869,7 @@
         <w:t xml:space="preserve">Moving forward, our immediate focus will be on dramatically expanding the agent’s action space to cover far more sophisticated CVEs. Additionally, we believe bridging this RL orchestrator with Large Language Models (LLMs) could drastically improve its contextual understanding of HTTP responses, finally closing the gap between structural pattern recognition and human-like logic comprehension. Ultimately, this research lays down a solid foundation for the next massive leap in intelligent, adaptive, and scalable automated pentesting frameworks.</w:t>
       </w:r>
     </w:p>
-    <w:bookmarkEnd w:id="19"/>
+    <w:bookmarkEnd w:id="20"/>
     <w:sectPr>
       <w:footnotePr>
         <w:numRestart w:val="eachSect"/>

</xml_diff>